<commit_message>
fix(writing): remove redundant statistical symbol styling
Let statistical symbols inherit the existing Times New Roman defaults instead of requiring italic, upright, or bold runs. Keep P-value precision, spacing, and template precedence; update generated showcases and forbid the old styling fragments.

Validation: six skill validators, 177 unit tests, workflow contract audit, and DOCX/PDF/PNG render inspection. Compatibility: explicit user, institution, and journal formatting still takes precedence.
</commit_message>
<xml_diff>
--- a/docs/demo/output/document-skills/epi-study-design/home-bp-monitoring-protocol-sap.docx
+++ b/docs/demo/output/document-skills/epi-study-design/home-bp-monitoring-protocol-sap.docx
@@ -758,7 +758,7 @@
           <w:color w:val="000000"/>
           <w:sz w:val="21"/>
         </w:rPr>
-        <w:t>主要分析人群包括满足纳入条件、具有基线暴露判定且至少有一次结局随访的研究对象；是否采用全分析集及其与完全病例分析的关系须在实施前冻结。首先按暴露组描述基线特征和样本流，连续变量根据分布报告均数与标准差或中位数与四分位数，分类变量报告人数与构成比。组间描述不以单因素检验结果决定协变量纳入；若报告传统的独立样本 t 检验，统计符号按学术规范排版，并同时报告效应量和区间估计。</w:t>
+        <w:t>主要分析人群包括满足纳入条件、具有基线暴露判定且至少有一次结局随访的研究对象；是否采用全分析集及其与完全病例分析的关系须在实施前冻结。首先按暴露组描述基线特征和样本流，连续变量根据分布报告均数与标准差或中位数与四分位数，分类变量报告人数与构成比。组间描述不以单因素检验结果决定协变量纳入；若报告传统的独立样本 t 检验，应同时报告效应量和区间估计。</w:t>
       </w:r>
     </w:p>
     <w:p>
@@ -775,27 +775,7 @@
           <w:color w:val="000000"/>
           <w:sz w:val="21"/>
         </w:rPr>
-        <w:t xml:space="preserve">主要模型拟采用线性回归估计 12 个月收缩压变化的调整后均值差，预设调整基线收缩压、年龄、性别、糖尿病、慢性肾病、药物类别、用药依从性和就诊频率。模型报告回归系数、95% 置信区间和必要的 </w:t>
-      </w:r>
-      <w:r>
-        <w:rPr>
-          <w:rFonts w:ascii="Times New Roman" w:hAnsi="Times New Roman" w:eastAsia="宋体"/>
-          <w:b/>
-          <w:i/>
-          <w:color w:val="000000"/>
-          <w:sz w:val="21"/>
-        </w:rPr>
-        <w:t>P</w:t>
-      </w:r>
-      <w:r>
-        <w:rPr>
-          <w:rFonts w:ascii="Times New Roman" w:hAnsi="Times New Roman" w:eastAsia="宋体"/>
-          <w:b w:val="0"/>
-          <w:i w:val="0"/>
-          <w:color w:val="000000"/>
-          <w:sz w:val="21"/>
-        </w:rPr>
-        <w:t xml:space="preserve"> 值，检查残差分布、异方差和高影响观测。若结局分布或随访结构使线性模型不适用，任何替代模型均作为方案修订记录，不根据显著性选择。</w:t>
+        <w:t>主要模型拟采用线性回归估计 12 个月收缩压变化的调整后均值差，预设调整基线收缩压、年龄、性别、糖尿病、慢性肾病、药物类别、用药依从性和就诊频率。模型报告回归系数、95% 置信区间和必要的 P 值，检查残差分布、异方差和高影响观测。若结局分布或随访结构使线性模型不适用，任何替代模型均作为方案修订记录，不根据显著性选择。</w:t>
       </w:r>
     </w:p>
     <w:p>

</xml_diff>